<commit_message>
docs: BLL to Services
</commit_message>
<xml_diff>
--- a/documentatie/Technisch Ontwerp.docx
+++ b/documentatie/Technisch Ontwerp.docx
@@ -5165,7 +5165,15 @@
                 <w:sz w:val="20"/>
                 <w:szCs w:val="20"/>
               </w:rPr>
-              <w:t>/Carver/BLL</w:t>
+              <w:t>/Carver/</w:t>
+            </w:r>
+            <w:r>
+              <w:rPr>
+                <w:rFonts w:hint="eastAsia"/>
+                <w:sz w:val="20"/>
+                <w:szCs w:val="20"/>
+              </w:rPr>
+              <w:t>Services</w:t>
             </w:r>
           </w:p>
         </w:tc>
@@ -5178,6 +5186,7 @@
               <w:jc w:val="left"/>
               <w:cnfStyle w:val="000000000000" w:firstRow="0" w:lastRow="0" w:firstColumn="0" w:lastColumn="0" w:oddVBand="0" w:evenVBand="0" w:oddHBand="0" w:evenHBand="0" w:firstRowFirstColumn="0" w:firstRowLastColumn="0" w:lastRowFirstColumn="0" w:lastRowLastColumn="0"/>
               <w:rPr>
+                <w:rFonts w:hint="eastAsia"/>
                 <w:sz w:val="20"/>
                 <w:szCs w:val="20"/>
               </w:rPr>
@@ -5189,6 +5198,14 @@
                 <w:szCs w:val="20"/>
               </w:rPr>
               <w:t>Verwerk tussen UI en DAL, validatie</w:t>
+            </w:r>
+            <w:r>
+              <w:rPr>
+                <w:rFonts w:hint="eastAsia"/>
+                <w:sz w:val="20"/>
+                <w:szCs w:val="20"/>
+              </w:rPr>
+              <w:t xml:space="preserve"> (BLL)</w:t>
             </w:r>
           </w:p>
         </w:tc>
@@ -11335,9 +11352,991 @@
         </w:tc>
       </w:tr>
     </w:tbl>
+    <w:p/>
     <w:p>
       <w:pPr>
-        <w:pStyle w:val="Kop2"/>
+        <w:pStyle w:val="Kop1"/>
+      </w:pPr>
+      <w:r>
+        <w:rPr>
+          <w:rFonts w:hint="eastAsia"/>
+        </w:rPr>
+        <w:t>7. Sequence Diagram</w:t>
+      </w:r>
+    </w:p>
+    <w:p>
+      <w:pPr>
+        <w:spacing w:before="60" w:after="60"/>
+      </w:pPr>
+      <w:r>
+        <w:rPr>
+          <w:rFonts w:eastAsia="Arial"/>
+        </w:rPr>
+        <w:t>Het sequence diagram toont de volgorde van berichten tussen de lagen bij het registreren van een prospect:</w:t>
+      </w:r>
+    </w:p>
+    <w:p>
+      <w:pPr>
+        <w:spacing w:before="80" w:after="80"/>
+      </w:pPr>
+    </w:p>
+    <w:tbl>
+      <w:tblPr>
+        <w:tblStyle w:val="Rastertabel4-Accent4"/>
+        <w:tblW w:w="9026" w:type="dxa"/>
+        <w:tblLook w:val="04A0" w:firstRow="1" w:lastRow="0" w:firstColumn="1" w:lastColumn="0" w:noHBand="0" w:noVBand="1"/>
+      </w:tblPr>
+      <w:tblGrid>
+        <w:gridCol w:w="394"/>
+        <w:gridCol w:w="1997"/>
+        <w:gridCol w:w="2272"/>
+        <w:gridCol w:w="2651"/>
+        <w:gridCol w:w="1712"/>
+      </w:tblGrid>
+      <w:tr>
+        <w:trPr>
+          <w:cnfStyle w:val="100000000000" w:firstRow="1" w:lastRow="0" w:firstColumn="0" w:lastColumn="0" w:oddVBand="0" w:evenVBand="0" w:oddHBand="0" w:evenHBand="0" w:firstRowFirstColumn="0" w:firstRowLastColumn="0" w:lastRowFirstColumn="0" w:lastRowLastColumn="0"/>
+          <w:trHeight w:val="432"/>
+        </w:trPr>
+        <w:tc>
+          <w:tcPr>
+            <w:cnfStyle w:val="001000000000" w:firstRow="0" w:lastRow="0" w:firstColumn="1" w:lastColumn="0" w:oddVBand="0" w:evenVBand="0" w:oddHBand="0" w:evenHBand="0" w:firstRowFirstColumn="0" w:firstRowLastColumn="0" w:lastRowFirstColumn="0" w:lastRowLastColumn="0"/>
+            <w:tcW w:w="400" w:type="dxa"/>
+          </w:tcPr>
+          <w:p>
+            <w:r>
+              <w:rPr>
+                <w:rFonts w:eastAsia="Arial"/>
+                <w:color w:val="FFFFFF"/>
+                <w:sz w:val="20"/>
+                <w:szCs w:val="20"/>
+              </w:rPr>
+              <w:t>#</w:t>
+            </w:r>
+          </w:p>
+        </w:tc>
+        <w:tc>
+          <w:tcPr>
+            <w:tcW w:w="2000" w:type="dxa"/>
+          </w:tcPr>
+          <w:p>
+            <w:pPr>
+              <w:cnfStyle w:val="100000000000" w:firstRow="1" w:lastRow="0" w:firstColumn="0" w:lastColumn="0" w:oddVBand="0" w:evenVBand="0" w:oddHBand="0" w:evenHBand="0" w:firstRowFirstColumn="0" w:firstRowLastColumn="0" w:lastRowFirstColumn="0" w:lastRowLastColumn="0"/>
+            </w:pPr>
+            <w:r>
+              <w:rPr>
+                <w:rFonts w:eastAsia="Arial"/>
+                <w:color w:val="FFFFFF"/>
+                <w:sz w:val="20"/>
+                <w:szCs w:val="20"/>
+              </w:rPr>
+              <w:t>Van</w:t>
+            </w:r>
+          </w:p>
+        </w:tc>
+        <w:tc>
+          <w:tcPr>
+            <w:tcW w:w="2300" w:type="dxa"/>
+          </w:tcPr>
+          <w:p>
+            <w:pPr>
+              <w:cnfStyle w:val="100000000000" w:firstRow="1" w:lastRow="0" w:firstColumn="0" w:lastColumn="0" w:oddVBand="0" w:evenVBand="0" w:oddHBand="0" w:evenHBand="0" w:firstRowFirstColumn="0" w:firstRowLastColumn="0" w:lastRowFirstColumn="0" w:lastRowLastColumn="0"/>
+            </w:pPr>
+            <w:r>
+              <w:rPr>
+                <w:rFonts w:eastAsia="Arial"/>
+                <w:color w:val="FFFFFF"/>
+                <w:sz w:val="20"/>
+                <w:szCs w:val="20"/>
+              </w:rPr>
+              <w:t>Naar</w:t>
+            </w:r>
+          </w:p>
+        </w:tc>
+        <w:tc>
+          <w:tcPr>
+            <w:tcW w:w="2600" w:type="dxa"/>
+          </w:tcPr>
+          <w:p>
+            <w:pPr>
+              <w:cnfStyle w:val="100000000000" w:firstRow="1" w:lastRow="0" w:firstColumn="0" w:lastColumn="0" w:oddVBand="0" w:evenVBand="0" w:oddHBand="0" w:evenHBand="0" w:firstRowFirstColumn="0" w:firstRowLastColumn="0" w:lastRowFirstColumn="0" w:lastRowLastColumn="0"/>
+            </w:pPr>
+            <w:r>
+              <w:rPr>
+                <w:rFonts w:eastAsia="Arial"/>
+                <w:color w:val="FFFFFF"/>
+                <w:sz w:val="20"/>
+                <w:szCs w:val="20"/>
+              </w:rPr>
+              <w:t>Bericht / Methode</w:t>
+            </w:r>
+          </w:p>
+        </w:tc>
+        <w:tc>
+          <w:tcPr>
+            <w:tcW w:w="1726" w:type="dxa"/>
+          </w:tcPr>
+          <w:p>
+            <w:pPr>
+              <w:cnfStyle w:val="100000000000" w:firstRow="1" w:lastRow="0" w:firstColumn="0" w:lastColumn="0" w:oddVBand="0" w:evenVBand="0" w:oddHBand="0" w:evenHBand="0" w:firstRowFirstColumn="0" w:firstRowLastColumn="0" w:lastRowFirstColumn="0" w:lastRowLastColumn="0"/>
+            </w:pPr>
+            <w:r>
+              <w:rPr>
+                <w:rFonts w:eastAsia="Arial"/>
+                <w:color w:val="FFFFFF"/>
+                <w:sz w:val="20"/>
+                <w:szCs w:val="20"/>
+              </w:rPr>
+              <w:t>Retourwaarde</w:t>
+            </w:r>
+          </w:p>
+        </w:tc>
+      </w:tr>
+      <w:tr>
+        <w:trPr>
+          <w:cnfStyle w:val="000000100000" w:firstRow="0" w:lastRow="0" w:firstColumn="0" w:lastColumn="0" w:oddVBand="0" w:evenVBand="0" w:oddHBand="1" w:evenHBand="0" w:firstRowFirstColumn="0" w:firstRowLastColumn="0" w:lastRowFirstColumn="0" w:lastRowLastColumn="0"/>
+          <w:trHeight w:val="432"/>
+        </w:trPr>
+        <w:tc>
+          <w:tcPr>
+            <w:cnfStyle w:val="001000000000" w:firstRow="0" w:lastRow="0" w:firstColumn="1" w:lastColumn="0" w:oddVBand="0" w:evenVBand="0" w:oddHBand="0" w:evenHBand="0" w:firstRowFirstColumn="0" w:firstRowLastColumn="0" w:lastRowFirstColumn="0" w:lastRowLastColumn="0"/>
+            <w:tcW w:w="400" w:type="dxa"/>
+          </w:tcPr>
+          <w:p>
+            <w:r>
+              <w:rPr>
+                <w:rFonts w:eastAsia="Arial"/>
+                <w:sz w:val="20"/>
+                <w:szCs w:val="20"/>
+              </w:rPr>
+              <w:t>1</w:t>
+            </w:r>
+          </w:p>
+        </w:tc>
+        <w:tc>
+          <w:tcPr>
+            <w:tcW w:w="2000" w:type="dxa"/>
+          </w:tcPr>
+          <w:p>
+            <w:pPr>
+              <w:cnfStyle w:val="000000100000" w:firstRow="0" w:lastRow="0" w:firstColumn="0" w:lastColumn="0" w:oddVBand="0" w:evenVBand="0" w:oddHBand="1" w:evenHBand="0" w:firstRowFirstColumn="0" w:firstRowLastColumn="0" w:lastRowFirstColumn="0" w:lastRowLastColumn="0"/>
+            </w:pPr>
+            <w:r>
+              <w:rPr>
+                <w:rFonts w:eastAsia="Arial"/>
+                <w:sz w:val="20"/>
+                <w:szCs w:val="20"/>
+              </w:rPr>
+              <w:t>Medewerker</w:t>
+            </w:r>
+          </w:p>
+        </w:tc>
+        <w:tc>
+          <w:tcPr>
+            <w:tcW w:w="2300" w:type="dxa"/>
+          </w:tcPr>
+          <w:p>
+            <w:pPr>
+              <w:cnfStyle w:val="000000100000" w:firstRow="0" w:lastRow="0" w:firstColumn="0" w:lastColumn="0" w:oddVBand="0" w:evenVBand="0" w:oddHBand="1" w:evenHBand="0" w:firstRowFirstColumn="0" w:firstRowLastColumn="0" w:lastRowFirstColumn="0" w:lastRowLastColumn="0"/>
+            </w:pPr>
+            <w:r>
+              <w:rPr>
+                <w:rFonts w:eastAsia="Arial"/>
+                <w:sz w:val="20"/>
+                <w:szCs w:val="20"/>
+              </w:rPr>
+              <w:t>ProspectForm (UI)</w:t>
+            </w:r>
+          </w:p>
+        </w:tc>
+        <w:tc>
+          <w:tcPr>
+            <w:tcW w:w="2600" w:type="dxa"/>
+          </w:tcPr>
+          <w:p>
+            <w:pPr>
+              <w:cnfStyle w:val="000000100000" w:firstRow="0" w:lastRow="0" w:firstColumn="0" w:lastColumn="0" w:oddVBand="0" w:evenVBand="0" w:oddHBand="1" w:evenHBand="0" w:firstRowFirstColumn="0" w:firstRowLastColumn="0" w:lastRowFirstColumn="0" w:lastRowLastColumn="0"/>
+            </w:pPr>
+            <w:r>
+              <w:rPr>
+                <w:rFonts w:eastAsia="Arial"/>
+                <w:sz w:val="20"/>
+                <w:szCs w:val="20"/>
+              </w:rPr>
+              <w:t>Vult formulier in en klikt Opslaan</w:t>
+            </w:r>
+          </w:p>
+        </w:tc>
+        <w:tc>
+          <w:tcPr>
+            <w:tcW w:w="1726" w:type="dxa"/>
+          </w:tcPr>
+          <w:p>
+            <w:pPr>
+              <w:cnfStyle w:val="000000100000" w:firstRow="0" w:lastRow="0" w:firstColumn="0" w:lastColumn="0" w:oddVBand="0" w:evenVBand="0" w:oddHBand="1" w:evenHBand="0" w:firstRowFirstColumn="0" w:firstRowLastColumn="0" w:lastRowFirstColumn="0" w:lastRowLastColumn="0"/>
+            </w:pPr>
+            <w:r>
+              <w:rPr>
+                <w:rFonts w:eastAsia="Arial"/>
+                <w:sz w:val="20"/>
+                <w:szCs w:val="20"/>
+              </w:rPr>
+              <w:t>—</w:t>
+            </w:r>
+          </w:p>
+        </w:tc>
+      </w:tr>
+      <w:tr>
+        <w:trPr>
+          <w:trHeight w:val="432"/>
+        </w:trPr>
+        <w:tc>
+          <w:tcPr>
+            <w:cnfStyle w:val="001000000000" w:firstRow="0" w:lastRow="0" w:firstColumn="1" w:lastColumn="0" w:oddVBand="0" w:evenVBand="0" w:oddHBand="0" w:evenHBand="0" w:firstRowFirstColumn="0" w:firstRowLastColumn="0" w:lastRowFirstColumn="0" w:lastRowLastColumn="0"/>
+            <w:tcW w:w="400" w:type="dxa"/>
+          </w:tcPr>
+          <w:p>
+            <w:r>
+              <w:rPr>
+                <w:rFonts w:eastAsia="Arial"/>
+                <w:sz w:val="20"/>
+                <w:szCs w:val="20"/>
+              </w:rPr>
+              <w:t>2</w:t>
+            </w:r>
+          </w:p>
+        </w:tc>
+        <w:tc>
+          <w:tcPr>
+            <w:tcW w:w="2000" w:type="dxa"/>
+          </w:tcPr>
+          <w:p>
+            <w:pPr>
+              <w:cnfStyle w:val="000000000000" w:firstRow="0" w:lastRow="0" w:firstColumn="0" w:lastColumn="0" w:oddVBand="0" w:evenVBand="0" w:oddHBand="0" w:evenHBand="0" w:firstRowFirstColumn="0" w:firstRowLastColumn="0" w:lastRowFirstColumn="0" w:lastRowLastColumn="0"/>
+            </w:pPr>
+            <w:r>
+              <w:rPr>
+                <w:rFonts w:eastAsia="Arial"/>
+                <w:sz w:val="20"/>
+                <w:szCs w:val="20"/>
+              </w:rPr>
+              <w:t>ProspectForm (UI)</w:t>
+            </w:r>
+          </w:p>
+        </w:tc>
+        <w:tc>
+          <w:tcPr>
+            <w:tcW w:w="2300" w:type="dxa"/>
+          </w:tcPr>
+          <w:p>
+            <w:pPr>
+              <w:cnfStyle w:val="000000000000" w:firstRow="0" w:lastRow="0" w:firstColumn="0" w:lastColumn="0" w:oddVBand="0" w:evenVBand="0" w:oddHBand="0" w:evenHBand="0" w:firstRowFirstColumn="0" w:firstRowLastColumn="0" w:lastRowFirstColumn="0" w:lastRowLastColumn="0"/>
+            </w:pPr>
+            <w:r>
+              <w:rPr>
+                <w:rFonts w:eastAsia="Arial"/>
+                <w:sz w:val="20"/>
+                <w:szCs w:val="20"/>
+              </w:rPr>
+              <w:t>ProspectBLL (BLL)</w:t>
+            </w:r>
+          </w:p>
+        </w:tc>
+        <w:tc>
+          <w:tcPr>
+            <w:tcW w:w="2600" w:type="dxa"/>
+          </w:tcPr>
+          <w:p>
+            <w:pPr>
+              <w:cnfStyle w:val="000000000000" w:firstRow="0" w:lastRow="0" w:firstColumn="0" w:lastColumn="0" w:oddVBand="0" w:evenVBand="0" w:oddHBand="0" w:evenHBand="0" w:firstRowFirstColumn="0" w:firstRowLastColumn="0" w:lastRowFirstColumn="0" w:lastRowLastColumn="0"/>
+            </w:pPr>
+            <w:r>
+              <w:rPr>
+                <w:rFonts w:eastAsia="Arial"/>
+                <w:sz w:val="20"/>
+                <w:szCs w:val="20"/>
+              </w:rPr>
+              <w:t>ValideerProspect(prospect)</w:t>
+            </w:r>
+          </w:p>
+        </w:tc>
+        <w:tc>
+          <w:tcPr>
+            <w:tcW w:w="1726" w:type="dxa"/>
+          </w:tcPr>
+          <w:p>
+            <w:pPr>
+              <w:cnfStyle w:val="000000000000" w:firstRow="0" w:lastRow="0" w:firstColumn="0" w:lastColumn="0" w:oddVBand="0" w:evenVBand="0" w:oddHBand="0" w:evenHBand="0" w:firstRowFirstColumn="0" w:firstRowLastColumn="0" w:lastRowFirstColumn="0" w:lastRowLastColumn="0"/>
+            </w:pPr>
+            <w:r>
+              <w:rPr>
+                <w:rFonts w:eastAsia="Arial"/>
+                <w:sz w:val="20"/>
+                <w:szCs w:val="20"/>
+              </w:rPr>
+              <w:t>true / false + foutmelding</w:t>
+            </w:r>
+          </w:p>
+        </w:tc>
+      </w:tr>
+      <w:tr>
+        <w:trPr>
+          <w:cnfStyle w:val="000000100000" w:firstRow="0" w:lastRow="0" w:firstColumn="0" w:lastColumn="0" w:oddVBand="0" w:evenVBand="0" w:oddHBand="1" w:evenHBand="0" w:firstRowFirstColumn="0" w:firstRowLastColumn="0" w:lastRowFirstColumn="0" w:lastRowLastColumn="0"/>
+          <w:trHeight w:val="432"/>
+        </w:trPr>
+        <w:tc>
+          <w:tcPr>
+            <w:cnfStyle w:val="001000000000" w:firstRow="0" w:lastRow="0" w:firstColumn="1" w:lastColumn="0" w:oddVBand="0" w:evenVBand="0" w:oddHBand="0" w:evenHBand="0" w:firstRowFirstColumn="0" w:firstRowLastColumn="0" w:lastRowFirstColumn="0" w:lastRowLastColumn="0"/>
+            <w:tcW w:w="400" w:type="dxa"/>
+          </w:tcPr>
+          <w:p>
+            <w:r>
+              <w:rPr>
+                <w:rFonts w:eastAsia="Arial"/>
+                <w:sz w:val="20"/>
+                <w:szCs w:val="20"/>
+              </w:rPr>
+              <w:t>3</w:t>
+            </w:r>
+          </w:p>
+        </w:tc>
+        <w:tc>
+          <w:tcPr>
+            <w:tcW w:w="2000" w:type="dxa"/>
+          </w:tcPr>
+          <w:p>
+            <w:pPr>
+              <w:cnfStyle w:val="000000100000" w:firstRow="0" w:lastRow="0" w:firstColumn="0" w:lastColumn="0" w:oddVBand="0" w:evenVBand="0" w:oddHBand="1" w:evenHBand="0" w:firstRowFirstColumn="0" w:firstRowLastColumn="0" w:lastRowFirstColumn="0" w:lastRowLastColumn="0"/>
+            </w:pPr>
+            <w:r>
+              <w:rPr>
+                <w:rFonts w:eastAsia="Arial"/>
+                <w:sz w:val="20"/>
+                <w:szCs w:val="20"/>
+              </w:rPr>
+              <w:t>ProspectForm (UI)</w:t>
+            </w:r>
+          </w:p>
+        </w:tc>
+        <w:tc>
+          <w:tcPr>
+            <w:tcW w:w="2300" w:type="dxa"/>
+          </w:tcPr>
+          <w:p>
+            <w:pPr>
+              <w:cnfStyle w:val="000000100000" w:firstRow="0" w:lastRow="0" w:firstColumn="0" w:lastColumn="0" w:oddVBand="0" w:evenVBand="0" w:oddHBand="1" w:evenHBand="0" w:firstRowFirstColumn="0" w:firstRowLastColumn="0" w:lastRowFirstColumn="0" w:lastRowLastColumn="0"/>
+            </w:pPr>
+            <w:r>
+              <w:rPr>
+                <w:rFonts w:eastAsia="Arial"/>
+                <w:sz w:val="20"/>
+                <w:szCs w:val="20"/>
+              </w:rPr>
+              <w:t>ProspectBLL (BLL)</w:t>
+            </w:r>
+          </w:p>
+        </w:tc>
+        <w:tc>
+          <w:tcPr>
+            <w:tcW w:w="2600" w:type="dxa"/>
+          </w:tcPr>
+          <w:p>
+            <w:pPr>
+              <w:cnfStyle w:val="000000100000" w:firstRow="0" w:lastRow="0" w:firstColumn="0" w:lastColumn="0" w:oddVBand="0" w:evenVBand="0" w:oddHBand="1" w:evenHBand="0" w:firstRowFirstColumn="0" w:firstRowLastColumn="0" w:lastRowFirstColumn="0" w:lastRowLastColumn="0"/>
+            </w:pPr>
+            <w:r>
+              <w:rPr>
+                <w:rFonts w:eastAsia="Arial"/>
+                <w:sz w:val="20"/>
+                <w:szCs w:val="20"/>
+              </w:rPr>
+              <w:t>OpslaanProspect(prospect)</w:t>
+            </w:r>
+          </w:p>
+        </w:tc>
+        <w:tc>
+          <w:tcPr>
+            <w:tcW w:w="1726" w:type="dxa"/>
+          </w:tcPr>
+          <w:p>
+            <w:pPr>
+              <w:cnfStyle w:val="000000100000" w:firstRow="0" w:lastRow="0" w:firstColumn="0" w:lastColumn="0" w:oddVBand="0" w:evenVBand="0" w:oddHBand="1" w:evenHBand="0" w:firstRowFirstColumn="0" w:firstRowLastColumn="0" w:lastRowFirstColumn="0" w:lastRowLastColumn="0"/>
+            </w:pPr>
+            <w:r>
+              <w:rPr>
+                <w:rFonts w:eastAsia="Arial"/>
+                <w:sz w:val="20"/>
+                <w:szCs w:val="20"/>
+              </w:rPr>
+              <w:t>bool succes</w:t>
+            </w:r>
+          </w:p>
+        </w:tc>
+      </w:tr>
+      <w:tr>
+        <w:trPr>
+          <w:trHeight w:val="432"/>
+        </w:trPr>
+        <w:tc>
+          <w:tcPr>
+            <w:cnfStyle w:val="001000000000" w:firstRow="0" w:lastRow="0" w:firstColumn="1" w:lastColumn="0" w:oddVBand="0" w:evenVBand="0" w:oddHBand="0" w:evenHBand="0" w:firstRowFirstColumn="0" w:firstRowLastColumn="0" w:lastRowFirstColumn="0" w:lastRowLastColumn="0"/>
+            <w:tcW w:w="400" w:type="dxa"/>
+          </w:tcPr>
+          <w:p>
+            <w:r>
+              <w:rPr>
+                <w:rFonts w:eastAsia="Arial"/>
+                <w:sz w:val="20"/>
+                <w:szCs w:val="20"/>
+              </w:rPr>
+              <w:t>4</w:t>
+            </w:r>
+          </w:p>
+        </w:tc>
+        <w:tc>
+          <w:tcPr>
+            <w:tcW w:w="2000" w:type="dxa"/>
+          </w:tcPr>
+          <w:p>
+            <w:pPr>
+              <w:cnfStyle w:val="000000000000" w:firstRow="0" w:lastRow="0" w:firstColumn="0" w:lastColumn="0" w:oddVBand="0" w:evenVBand="0" w:oddHBand="0" w:evenHBand="0" w:firstRowFirstColumn="0" w:firstRowLastColumn="0" w:lastRowFirstColumn="0" w:lastRowLastColumn="0"/>
+            </w:pPr>
+            <w:r>
+              <w:rPr>
+                <w:rFonts w:eastAsia="Arial"/>
+                <w:sz w:val="20"/>
+                <w:szCs w:val="20"/>
+              </w:rPr>
+              <w:t>ProspectBLL (BLL)</w:t>
+            </w:r>
+          </w:p>
+        </w:tc>
+        <w:tc>
+          <w:tcPr>
+            <w:tcW w:w="2300" w:type="dxa"/>
+          </w:tcPr>
+          <w:p>
+            <w:pPr>
+              <w:cnfStyle w:val="000000000000" w:firstRow="0" w:lastRow="0" w:firstColumn="0" w:lastColumn="0" w:oddVBand="0" w:evenVBand="0" w:oddHBand="0" w:evenHBand="0" w:firstRowFirstColumn="0" w:firstRowLastColumn="0" w:lastRowFirstColumn="0" w:lastRowLastColumn="0"/>
+            </w:pPr>
+            <w:r>
+              <w:rPr>
+                <w:rFonts w:eastAsia="Arial"/>
+                <w:sz w:val="20"/>
+                <w:szCs w:val="20"/>
+              </w:rPr>
+              <w:t>ProspectRepository (DAL)</w:t>
+            </w:r>
+          </w:p>
+        </w:tc>
+        <w:tc>
+          <w:tcPr>
+            <w:tcW w:w="2600" w:type="dxa"/>
+          </w:tcPr>
+          <w:p>
+            <w:pPr>
+              <w:cnfStyle w:val="000000000000" w:firstRow="0" w:lastRow="0" w:firstColumn="0" w:lastColumn="0" w:oddVBand="0" w:evenVBand="0" w:oddHBand="0" w:evenHBand="0" w:firstRowFirstColumn="0" w:firstRowLastColumn="0" w:lastRowFirstColumn="0" w:lastRowLastColumn="0"/>
+            </w:pPr>
+            <w:r>
+              <w:rPr>
+                <w:rFonts w:eastAsia="Arial"/>
+                <w:sz w:val="20"/>
+                <w:szCs w:val="20"/>
+              </w:rPr>
+              <w:t>Insert(prospect)</w:t>
+            </w:r>
+          </w:p>
+        </w:tc>
+        <w:tc>
+          <w:tcPr>
+            <w:tcW w:w="1726" w:type="dxa"/>
+          </w:tcPr>
+          <w:p>
+            <w:pPr>
+              <w:cnfStyle w:val="000000000000" w:firstRow="0" w:lastRow="0" w:firstColumn="0" w:lastColumn="0" w:oddVBand="0" w:evenVBand="0" w:oddHBand="0" w:evenHBand="0" w:firstRowFirstColumn="0" w:firstRowLastColumn="0" w:lastRowFirstColumn="0" w:lastRowLastColumn="0"/>
+            </w:pPr>
+            <w:r>
+              <w:rPr>
+                <w:rFonts w:eastAsia="Arial"/>
+                <w:sz w:val="20"/>
+                <w:szCs w:val="20"/>
+              </w:rPr>
+              <w:t>int newID</w:t>
+            </w:r>
+          </w:p>
+        </w:tc>
+      </w:tr>
+      <w:tr>
+        <w:trPr>
+          <w:cnfStyle w:val="000000100000" w:firstRow="0" w:lastRow="0" w:firstColumn="0" w:lastColumn="0" w:oddVBand="0" w:evenVBand="0" w:oddHBand="1" w:evenHBand="0" w:firstRowFirstColumn="0" w:firstRowLastColumn="0" w:lastRowFirstColumn="0" w:lastRowLastColumn="0"/>
+          <w:trHeight w:val="432"/>
+        </w:trPr>
+        <w:tc>
+          <w:tcPr>
+            <w:cnfStyle w:val="001000000000" w:firstRow="0" w:lastRow="0" w:firstColumn="1" w:lastColumn="0" w:oddVBand="0" w:evenVBand="0" w:oddHBand="0" w:evenHBand="0" w:firstRowFirstColumn="0" w:firstRowLastColumn="0" w:lastRowFirstColumn="0" w:lastRowLastColumn="0"/>
+            <w:tcW w:w="400" w:type="dxa"/>
+          </w:tcPr>
+          <w:p>
+            <w:r>
+              <w:rPr>
+                <w:rFonts w:eastAsia="Arial"/>
+                <w:sz w:val="20"/>
+                <w:szCs w:val="20"/>
+              </w:rPr>
+              <w:t>5</w:t>
+            </w:r>
+          </w:p>
+        </w:tc>
+        <w:tc>
+          <w:tcPr>
+            <w:tcW w:w="2000" w:type="dxa"/>
+          </w:tcPr>
+          <w:p>
+            <w:pPr>
+              <w:cnfStyle w:val="000000100000" w:firstRow="0" w:lastRow="0" w:firstColumn="0" w:lastColumn="0" w:oddVBand="0" w:evenVBand="0" w:oddHBand="1" w:evenHBand="0" w:firstRowFirstColumn="0" w:firstRowLastColumn="0" w:lastRowFirstColumn="0" w:lastRowLastColumn="0"/>
+            </w:pPr>
+            <w:r>
+              <w:rPr>
+                <w:rFonts w:eastAsia="Arial"/>
+                <w:sz w:val="20"/>
+                <w:szCs w:val="20"/>
+              </w:rPr>
+              <w:t>ProspectRepository (DAL)</w:t>
+            </w:r>
+          </w:p>
+        </w:tc>
+        <w:tc>
+          <w:tcPr>
+            <w:tcW w:w="2300" w:type="dxa"/>
+          </w:tcPr>
+          <w:p>
+            <w:pPr>
+              <w:cnfStyle w:val="000000100000" w:firstRow="0" w:lastRow="0" w:firstColumn="0" w:lastColumn="0" w:oddVBand="0" w:evenVBand="0" w:oddHBand="1" w:evenHBand="0" w:firstRowFirstColumn="0" w:firstRowLastColumn="0" w:lastRowFirstColumn="0" w:lastRowLastColumn="0"/>
+            </w:pPr>
+            <w:r>
+              <w:rPr>
+                <w:rFonts w:eastAsia="Arial"/>
+                <w:sz w:val="20"/>
+                <w:szCs w:val="20"/>
+              </w:rPr>
+              <w:t>SQL Server (DB)</w:t>
+            </w:r>
+          </w:p>
+        </w:tc>
+        <w:tc>
+          <w:tcPr>
+            <w:tcW w:w="2600" w:type="dxa"/>
+          </w:tcPr>
+          <w:p>
+            <w:pPr>
+              <w:cnfStyle w:val="000000100000" w:firstRow="0" w:lastRow="0" w:firstColumn="0" w:lastColumn="0" w:oddVBand="0" w:evenVBand="0" w:oddHBand="1" w:evenHBand="0" w:firstRowFirstColumn="0" w:firstRowLastColumn="0" w:lastRowFirstColumn="0" w:lastRowLastColumn="0"/>
+            </w:pPr>
+            <w:r>
+              <w:rPr>
+                <w:rFonts w:eastAsia="Arial"/>
+                <w:sz w:val="20"/>
+                <w:szCs w:val="20"/>
+              </w:rPr>
+              <w:t>INSERT INTO Prospects ...</w:t>
+            </w:r>
+          </w:p>
+        </w:tc>
+        <w:tc>
+          <w:tcPr>
+            <w:tcW w:w="1726" w:type="dxa"/>
+          </w:tcPr>
+          <w:p>
+            <w:pPr>
+              <w:cnfStyle w:val="000000100000" w:firstRow="0" w:lastRow="0" w:firstColumn="0" w:lastColumn="0" w:oddVBand="0" w:evenVBand="0" w:oddHBand="1" w:evenHBand="0" w:firstRowFirstColumn="0" w:firstRowLastColumn="0" w:lastRowFirstColumn="0" w:lastRowLastColumn="0"/>
+            </w:pPr>
+            <w:r>
+              <w:rPr>
+                <w:rFonts w:eastAsia="Arial"/>
+                <w:sz w:val="20"/>
+                <w:szCs w:val="20"/>
+              </w:rPr>
+              <w:t>1 row affected</w:t>
+            </w:r>
+          </w:p>
+        </w:tc>
+      </w:tr>
+      <w:tr>
+        <w:trPr>
+          <w:trHeight w:val="432"/>
+        </w:trPr>
+        <w:tc>
+          <w:tcPr>
+            <w:cnfStyle w:val="001000000000" w:firstRow="0" w:lastRow="0" w:firstColumn="1" w:lastColumn="0" w:oddVBand="0" w:evenVBand="0" w:oddHBand="0" w:evenHBand="0" w:firstRowFirstColumn="0" w:firstRowLastColumn="0" w:lastRowFirstColumn="0" w:lastRowLastColumn="0"/>
+            <w:tcW w:w="400" w:type="dxa"/>
+          </w:tcPr>
+          <w:p>
+            <w:r>
+              <w:rPr>
+                <w:rFonts w:eastAsia="Arial"/>
+                <w:sz w:val="20"/>
+                <w:szCs w:val="20"/>
+              </w:rPr>
+              <w:t>6</w:t>
+            </w:r>
+          </w:p>
+        </w:tc>
+        <w:tc>
+          <w:tcPr>
+            <w:tcW w:w="2000" w:type="dxa"/>
+          </w:tcPr>
+          <w:p>
+            <w:pPr>
+              <w:cnfStyle w:val="000000000000" w:firstRow="0" w:lastRow="0" w:firstColumn="0" w:lastColumn="0" w:oddVBand="0" w:evenVBand="0" w:oddHBand="0" w:evenHBand="0" w:firstRowFirstColumn="0" w:firstRowLastColumn="0" w:lastRowFirstColumn="0" w:lastRowLastColumn="0"/>
+            </w:pPr>
+            <w:r>
+              <w:rPr>
+                <w:rFonts w:eastAsia="Arial"/>
+                <w:sz w:val="20"/>
+                <w:szCs w:val="20"/>
+              </w:rPr>
+              <w:t>SQL Server (DB)</w:t>
+            </w:r>
+          </w:p>
+        </w:tc>
+        <w:tc>
+          <w:tcPr>
+            <w:tcW w:w="2300" w:type="dxa"/>
+          </w:tcPr>
+          <w:p>
+            <w:pPr>
+              <w:cnfStyle w:val="000000000000" w:firstRow="0" w:lastRow="0" w:firstColumn="0" w:lastColumn="0" w:oddVBand="0" w:evenVBand="0" w:oddHBand="0" w:evenHBand="0" w:firstRowFirstColumn="0" w:firstRowLastColumn="0" w:lastRowFirstColumn="0" w:lastRowLastColumn="0"/>
+            </w:pPr>
+            <w:r>
+              <w:rPr>
+                <w:rFonts w:eastAsia="Arial"/>
+                <w:sz w:val="20"/>
+                <w:szCs w:val="20"/>
+              </w:rPr>
+              <w:t>ProspectRepository (DAL)</w:t>
+            </w:r>
+          </w:p>
+        </w:tc>
+        <w:tc>
+          <w:tcPr>
+            <w:tcW w:w="2600" w:type="dxa"/>
+          </w:tcPr>
+          <w:p>
+            <w:pPr>
+              <w:cnfStyle w:val="000000000000" w:firstRow="0" w:lastRow="0" w:firstColumn="0" w:lastColumn="0" w:oddVBand="0" w:evenVBand="0" w:oddHBand="0" w:evenHBand="0" w:firstRowFirstColumn="0" w:firstRowLastColumn="0" w:lastRowFirstColumn="0" w:lastRowLastColumn="0"/>
+            </w:pPr>
+            <w:r>
+              <w:rPr>
+                <w:rFonts w:eastAsia="Arial"/>
+                <w:sz w:val="20"/>
+                <w:szCs w:val="20"/>
+              </w:rPr>
+              <w:t>Bevestiging</w:t>
+            </w:r>
+          </w:p>
+        </w:tc>
+        <w:tc>
+          <w:tcPr>
+            <w:tcW w:w="1726" w:type="dxa"/>
+          </w:tcPr>
+          <w:p>
+            <w:pPr>
+              <w:cnfStyle w:val="000000000000" w:firstRow="0" w:lastRow="0" w:firstColumn="0" w:lastColumn="0" w:oddVBand="0" w:evenVBand="0" w:oddHBand="0" w:evenHBand="0" w:firstRowFirstColumn="0" w:firstRowLastColumn="0" w:lastRowFirstColumn="0" w:lastRowLastColumn="0"/>
+            </w:pPr>
+            <w:r>
+              <w:rPr>
+                <w:rFonts w:eastAsia="Arial"/>
+                <w:sz w:val="20"/>
+                <w:szCs w:val="20"/>
+              </w:rPr>
+              <w:t>newID</w:t>
+            </w:r>
+          </w:p>
+        </w:tc>
+      </w:tr>
+      <w:tr>
+        <w:trPr>
+          <w:cnfStyle w:val="000000100000" w:firstRow="0" w:lastRow="0" w:firstColumn="0" w:lastColumn="0" w:oddVBand="0" w:evenVBand="0" w:oddHBand="1" w:evenHBand="0" w:firstRowFirstColumn="0" w:firstRowLastColumn="0" w:lastRowFirstColumn="0" w:lastRowLastColumn="0"/>
+          <w:trHeight w:val="432"/>
+        </w:trPr>
+        <w:tc>
+          <w:tcPr>
+            <w:cnfStyle w:val="001000000000" w:firstRow="0" w:lastRow="0" w:firstColumn="1" w:lastColumn="0" w:oddVBand="0" w:evenVBand="0" w:oddHBand="0" w:evenHBand="0" w:firstRowFirstColumn="0" w:firstRowLastColumn="0" w:lastRowFirstColumn="0" w:lastRowLastColumn="0"/>
+            <w:tcW w:w="400" w:type="dxa"/>
+          </w:tcPr>
+          <w:p>
+            <w:r>
+              <w:rPr>
+                <w:rFonts w:eastAsia="Arial"/>
+                <w:sz w:val="20"/>
+                <w:szCs w:val="20"/>
+              </w:rPr>
+              <w:t>7</w:t>
+            </w:r>
+          </w:p>
+        </w:tc>
+        <w:tc>
+          <w:tcPr>
+            <w:tcW w:w="2000" w:type="dxa"/>
+          </w:tcPr>
+          <w:p>
+            <w:pPr>
+              <w:cnfStyle w:val="000000100000" w:firstRow="0" w:lastRow="0" w:firstColumn="0" w:lastColumn="0" w:oddVBand="0" w:evenVBand="0" w:oddHBand="1" w:evenHBand="0" w:firstRowFirstColumn="0" w:firstRowLastColumn="0" w:lastRowFirstColumn="0" w:lastRowLastColumn="0"/>
+            </w:pPr>
+            <w:r>
+              <w:rPr>
+                <w:rFonts w:eastAsia="Arial"/>
+                <w:sz w:val="20"/>
+                <w:szCs w:val="20"/>
+              </w:rPr>
+              <w:t>ProspectRepository (DAL)</w:t>
+            </w:r>
+          </w:p>
+        </w:tc>
+        <w:tc>
+          <w:tcPr>
+            <w:tcW w:w="2300" w:type="dxa"/>
+          </w:tcPr>
+          <w:p>
+            <w:pPr>
+              <w:cnfStyle w:val="000000100000" w:firstRow="0" w:lastRow="0" w:firstColumn="0" w:lastColumn="0" w:oddVBand="0" w:evenVBand="0" w:oddHBand="1" w:evenHBand="0" w:firstRowFirstColumn="0" w:firstRowLastColumn="0" w:lastRowFirstColumn="0" w:lastRowLastColumn="0"/>
+            </w:pPr>
+            <w:r>
+              <w:rPr>
+                <w:rFonts w:eastAsia="Arial"/>
+                <w:sz w:val="20"/>
+                <w:szCs w:val="20"/>
+              </w:rPr>
+              <w:t>ProspectBLL (BLL)</w:t>
+            </w:r>
+          </w:p>
+        </w:tc>
+        <w:tc>
+          <w:tcPr>
+            <w:tcW w:w="2600" w:type="dxa"/>
+          </w:tcPr>
+          <w:p>
+            <w:pPr>
+              <w:cnfStyle w:val="000000100000" w:firstRow="0" w:lastRow="0" w:firstColumn="0" w:lastColumn="0" w:oddVBand="0" w:evenVBand="0" w:oddHBand="1" w:evenHBand="0" w:firstRowFirstColumn="0" w:firstRowLastColumn="0" w:lastRowFirstColumn="0" w:lastRowLastColumn="0"/>
+            </w:pPr>
+            <w:r>
+              <w:rPr>
+                <w:rFonts w:eastAsia="Arial"/>
+                <w:sz w:val="20"/>
+                <w:szCs w:val="20"/>
+              </w:rPr>
+              <w:t>Retourneert nieuw ID</w:t>
+            </w:r>
+          </w:p>
+        </w:tc>
+        <w:tc>
+          <w:tcPr>
+            <w:tcW w:w="1726" w:type="dxa"/>
+          </w:tcPr>
+          <w:p>
+            <w:pPr>
+              <w:cnfStyle w:val="000000100000" w:firstRow="0" w:lastRow="0" w:firstColumn="0" w:lastColumn="0" w:oddVBand="0" w:evenVBand="0" w:oddHBand="1" w:evenHBand="0" w:firstRowFirstColumn="0" w:firstRowLastColumn="0" w:lastRowFirstColumn="0" w:lastRowLastColumn="0"/>
+            </w:pPr>
+            <w:r>
+              <w:rPr>
+                <w:rFonts w:eastAsia="Arial"/>
+                <w:sz w:val="20"/>
+                <w:szCs w:val="20"/>
+              </w:rPr>
+              <w:t>int</w:t>
+            </w:r>
+          </w:p>
+        </w:tc>
+      </w:tr>
+      <w:tr>
+        <w:trPr>
+          <w:trHeight w:val="432"/>
+        </w:trPr>
+        <w:tc>
+          <w:tcPr>
+            <w:cnfStyle w:val="001000000000" w:firstRow="0" w:lastRow="0" w:firstColumn="1" w:lastColumn="0" w:oddVBand="0" w:evenVBand="0" w:oddHBand="0" w:evenHBand="0" w:firstRowFirstColumn="0" w:firstRowLastColumn="0" w:lastRowFirstColumn="0" w:lastRowLastColumn="0"/>
+            <w:tcW w:w="400" w:type="dxa"/>
+          </w:tcPr>
+          <w:p>
+            <w:r>
+              <w:rPr>
+                <w:rFonts w:eastAsia="Arial"/>
+                <w:sz w:val="20"/>
+                <w:szCs w:val="20"/>
+              </w:rPr>
+              <w:t>8</w:t>
+            </w:r>
+          </w:p>
+        </w:tc>
+        <w:tc>
+          <w:tcPr>
+            <w:tcW w:w="2000" w:type="dxa"/>
+          </w:tcPr>
+          <w:p>
+            <w:pPr>
+              <w:cnfStyle w:val="000000000000" w:firstRow="0" w:lastRow="0" w:firstColumn="0" w:lastColumn="0" w:oddVBand="0" w:evenVBand="0" w:oddHBand="0" w:evenHBand="0" w:firstRowFirstColumn="0" w:firstRowLastColumn="0" w:lastRowFirstColumn="0" w:lastRowLastColumn="0"/>
+            </w:pPr>
+            <w:r>
+              <w:rPr>
+                <w:rFonts w:eastAsia="Arial"/>
+                <w:sz w:val="20"/>
+                <w:szCs w:val="20"/>
+              </w:rPr>
+              <w:t>ProspectBLL (BLL)</w:t>
+            </w:r>
+          </w:p>
+        </w:tc>
+        <w:tc>
+          <w:tcPr>
+            <w:tcW w:w="2300" w:type="dxa"/>
+          </w:tcPr>
+          <w:p>
+            <w:pPr>
+              <w:cnfStyle w:val="000000000000" w:firstRow="0" w:lastRow="0" w:firstColumn="0" w:lastColumn="0" w:oddVBand="0" w:evenVBand="0" w:oddHBand="0" w:evenHBand="0" w:firstRowFirstColumn="0" w:firstRowLastColumn="0" w:lastRowFirstColumn="0" w:lastRowLastColumn="0"/>
+            </w:pPr>
+            <w:r>
+              <w:rPr>
+                <w:rFonts w:eastAsia="Arial"/>
+                <w:sz w:val="20"/>
+                <w:szCs w:val="20"/>
+              </w:rPr>
+              <w:t>ProspectForm (UI)</w:t>
+            </w:r>
+          </w:p>
+        </w:tc>
+        <w:tc>
+          <w:tcPr>
+            <w:tcW w:w="2600" w:type="dxa"/>
+          </w:tcPr>
+          <w:p>
+            <w:pPr>
+              <w:cnfStyle w:val="000000000000" w:firstRow="0" w:lastRow="0" w:firstColumn="0" w:lastColumn="0" w:oddVBand="0" w:evenVBand="0" w:oddHBand="0" w:evenHBand="0" w:firstRowFirstColumn="0" w:firstRowLastColumn="0" w:lastRowFirstColumn="0" w:lastRowLastColumn="0"/>
+            </w:pPr>
+            <w:r>
+              <w:rPr>
+                <w:rFonts w:eastAsia="Arial"/>
+                <w:sz w:val="20"/>
+                <w:szCs w:val="20"/>
+              </w:rPr>
+              <w:t>Retourneert succes</w:t>
+            </w:r>
+          </w:p>
+        </w:tc>
+        <w:tc>
+          <w:tcPr>
+            <w:tcW w:w="1726" w:type="dxa"/>
+          </w:tcPr>
+          <w:p>
+            <w:pPr>
+              <w:cnfStyle w:val="000000000000" w:firstRow="0" w:lastRow="0" w:firstColumn="0" w:lastColumn="0" w:oddVBand="0" w:evenVBand="0" w:oddHBand="0" w:evenHBand="0" w:firstRowFirstColumn="0" w:firstRowLastColumn="0" w:lastRowFirstColumn="0" w:lastRowLastColumn="0"/>
+            </w:pPr>
+            <w:r>
+              <w:rPr>
+                <w:rFonts w:eastAsia="Arial"/>
+                <w:sz w:val="20"/>
+                <w:szCs w:val="20"/>
+              </w:rPr>
+              <w:t>true</w:t>
+            </w:r>
+          </w:p>
+        </w:tc>
+      </w:tr>
+      <w:tr>
+        <w:trPr>
+          <w:cnfStyle w:val="000000100000" w:firstRow="0" w:lastRow="0" w:firstColumn="0" w:lastColumn="0" w:oddVBand="0" w:evenVBand="0" w:oddHBand="1" w:evenHBand="0" w:firstRowFirstColumn="0" w:firstRowLastColumn="0" w:lastRowFirstColumn="0" w:lastRowLastColumn="0"/>
+          <w:trHeight w:val="432"/>
+        </w:trPr>
+        <w:tc>
+          <w:tcPr>
+            <w:cnfStyle w:val="001000000000" w:firstRow="0" w:lastRow="0" w:firstColumn="1" w:lastColumn="0" w:oddVBand="0" w:evenVBand="0" w:oddHBand="0" w:evenHBand="0" w:firstRowFirstColumn="0" w:firstRowLastColumn="0" w:lastRowFirstColumn="0" w:lastRowLastColumn="0"/>
+            <w:tcW w:w="400" w:type="dxa"/>
+          </w:tcPr>
+          <w:p>
+            <w:r>
+              <w:rPr>
+                <w:rFonts w:eastAsia="Arial"/>
+                <w:sz w:val="20"/>
+                <w:szCs w:val="20"/>
+              </w:rPr>
+              <w:t>9</w:t>
+            </w:r>
+          </w:p>
+        </w:tc>
+        <w:tc>
+          <w:tcPr>
+            <w:tcW w:w="2000" w:type="dxa"/>
+          </w:tcPr>
+          <w:p>
+            <w:pPr>
+              <w:cnfStyle w:val="000000100000" w:firstRow="0" w:lastRow="0" w:firstColumn="0" w:lastColumn="0" w:oddVBand="0" w:evenVBand="0" w:oddHBand="1" w:evenHBand="0" w:firstRowFirstColumn="0" w:firstRowLastColumn="0" w:lastRowFirstColumn="0" w:lastRowLastColumn="0"/>
+            </w:pPr>
+            <w:r>
+              <w:rPr>
+                <w:rFonts w:eastAsia="Arial"/>
+                <w:sz w:val="20"/>
+                <w:szCs w:val="20"/>
+              </w:rPr>
+              <w:t>ProspectForm (UI)</w:t>
+            </w:r>
+          </w:p>
+        </w:tc>
+        <w:tc>
+          <w:tcPr>
+            <w:tcW w:w="2300" w:type="dxa"/>
+          </w:tcPr>
+          <w:p>
+            <w:pPr>
+              <w:cnfStyle w:val="000000100000" w:firstRow="0" w:lastRow="0" w:firstColumn="0" w:lastColumn="0" w:oddVBand="0" w:evenVBand="0" w:oddHBand="1" w:evenHBand="0" w:firstRowFirstColumn="0" w:firstRowLastColumn="0" w:lastRowFirstColumn="0" w:lastRowLastColumn="0"/>
+            </w:pPr>
+            <w:r>
+              <w:rPr>
+                <w:rFonts w:eastAsia="Arial"/>
+                <w:sz w:val="20"/>
+                <w:szCs w:val="20"/>
+              </w:rPr>
+              <w:t>Medewerker</w:t>
+            </w:r>
+          </w:p>
+        </w:tc>
+        <w:tc>
+          <w:tcPr>
+            <w:tcW w:w="2600" w:type="dxa"/>
+          </w:tcPr>
+          <w:p>
+            <w:pPr>
+              <w:cnfStyle w:val="000000100000" w:firstRow="0" w:lastRow="0" w:firstColumn="0" w:lastColumn="0" w:oddVBand="0" w:evenVBand="0" w:oddHBand="1" w:evenHBand="0" w:firstRowFirstColumn="0" w:firstRowLastColumn="0" w:lastRowFirstColumn="0" w:lastRowLastColumn="0"/>
+            </w:pPr>
+            <w:r>
+              <w:rPr>
+                <w:rFonts w:eastAsia="Arial"/>
+                <w:sz w:val="20"/>
+                <w:szCs w:val="20"/>
+              </w:rPr>
+              <w:t>Toont bevestigingsmelding</w:t>
+            </w:r>
+          </w:p>
+        </w:tc>
+        <w:tc>
+          <w:tcPr>
+            <w:tcW w:w="1726" w:type="dxa"/>
+          </w:tcPr>
+          <w:p>
+            <w:pPr>
+              <w:cnfStyle w:val="000000100000" w:firstRow="0" w:lastRow="0" w:firstColumn="0" w:lastColumn="0" w:oddVBand="0" w:evenVBand="0" w:oddHBand="1" w:evenHBand="0" w:firstRowFirstColumn="0" w:firstRowLastColumn="0" w:lastRowFirstColumn="0" w:lastRowLastColumn="0"/>
+            </w:pPr>
+            <w:r>
+              <w:rPr>
+                <w:rFonts w:eastAsia="Arial"/>
+                <w:sz w:val="20"/>
+                <w:szCs w:val="20"/>
+              </w:rPr>
+              <w:t>—</w:t>
+            </w:r>
+          </w:p>
+        </w:tc>
+      </w:tr>
+    </w:tbl>
+    <w:p>
+      <w:pPr>
         <w:rPr>
           <w:rFonts w:hint="eastAsia"/>
         </w:rPr>

</xml_diff>